<commit_message>
Claudinho: revisão da Parte 2
Co-Authored-By: Claude Opus 5.5 <noreply@anthropic.com>
Claude-Session: https://claude.ai/code/session_01MJjUEEZrxQDEUifKK2vj9g
</commit_message>
<xml_diff>
--- a/roteiros/claudinho/Claudinho_Parte2.docx
+++ b/roteiros/claudinho/Claudinho_Parte2.docx
@@ -47,7 +47,7 @@
         <w:rPr>
           <w:color w:val="000000"/>
         </w:rPr>
-        <w:t>O disco vendeu um milhão e duzentas mil cópias.</w:t>
+        <w:t>Segundo os números divulgados na época, o disco passou de um milhão de cópias vendidas.</w:t>
       </w:r>
     </w:p>
     <w:p>
@@ -111,23 +111,7 @@
         <w:rPr>
           <w:color w:val="000000"/>
         </w:rPr>
-        <w:t>Desta vez, foram um milhão e meio de cópias. A música Quero Te Encontrar tocava sem parar. No mesmo ano, a MTV Brasil deu à dupla o prêmio de revelação.</w:t>
-      </w:r>
-    </w:p>
-    <w:p>
-      <w:r>
-        <w:rPr>
-          <w:color w:val="000000"/>
-        </w:rPr>
-        <w:t>Por trás daquele sucesso, havia uma história curiosa. Segundo relatos sobre a trajetória da dupla, os dois resistiram a gravar um dos maiores sucessos da carreira. Achavam a letra boba demais. Foi a pressão da gravadora que fez a música sair.</w:t>
-      </w:r>
-    </w:p>
-    <w:p>
-      <w:r>
-        <w:rPr>
-          <w:color w:val="000000"/>
-        </w:rPr>
-        <w:t>O público discordou dos dois. A música estourou.</w:t>
+        <w:t>Desta vez, as vendas foram ainda maiores. A música Quero Te Encontrar tocava sem parar. No mesmo ano, a MTV Brasil deu à dupla o prêmio de revelação.</w:t>
       </w:r>
     </w:p>
     <w:p>
@@ -151,7 +135,7 @@
         <w:rPr>
           <w:color w:val="000000"/>
         </w:rPr>
-        <w:t>Mais um milhão de cópias. A música que deu nome ao disco virou uma das mais tocadas do ano no país.</w:t>
+        <w:t>Mais um disco de platina. A música que deu nome ao disco virou uma das mais tocadas do ano no país.</w:t>
       </w:r>
     </w:p>
     <w:p>
@@ -167,7 +151,7 @@
         <w:rPr>
           <w:color w:val="000000"/>
         </w:rPr>
-        <w:t>Os prêmios e os discos de platina se acumulavam nas paredes.</w:t>
+        <w:t>Os discos de platina se acumulavam.</w:t>
       </w:r>
     </w:p>
     <w:p>
@@ -207,7 +191,7 @@
         <w:rPr>
           <w:color w:val="000000"/>
         </w:rPr>
-        <w:t>Buchecha virou o padrinho de Andressa.</w:t>
+        <w:t>Buchecha.</w:t>
       </w:r>
     </w:p>
     <w:p>
@@ -215,7 +199,7 @@
         <w:rPr>
           <w:color w:val="C00000"/>
         </w:rPr>
-        <w:t>Lembre bem dessa escolha. O melhor amigo de Claudinho virou padrinho da filha dele. Mas, muitos anos depois, essa mesma afilhada ia parar de falar com o padrinho. E a última conversa entre os dois aconteceu numa festa que deveria ter sido só de alegria.</w:t>
+        <w:t>Lembre bem dessa escolha. Muitos anos depois, essa mesma afilhada ia parar de falar com o padrinho. E a última conversa entre os dois aconteceu numa festa que deveria ter sido só de alegria.</w:t>
       </w:r>
     </w:p>
     <w:p>
@@ -263,15 +247,7 @@
         <w:rPr>
           <w:color w:val="000000"/>
         </w:rPr>
-        <w:t>Uma das pessoas mais próximas dele nessa época era o secretário da dupla, Ivan Manzieri.</w:t>
-      </w:r>
-    </w:p>
-    <w:p>
-      <w:r>
-        <w:rPr>
-          <w:color w:val="000000"/>
-        </w:rPr>
-        <w:t>Ivan cuidava de compromissos e de viagens. Estava sempre por perto.</w:t>
+        <w:t>Nessa equipe estava o secretário da dupla, Ivan Manzieri. Ele acompanhava os dois nas viagens.</w:t>
       </w:r>
     </w:p>
     <w:p>
@@ -327,7 +303,7 @@
         <w:rPr>
           <w:color w:val="000000"/>
         </w:rPr>
-        <w:t>Músicas como Nosso Sonho e Fico Assim Sem Você já faziam parte da vida de milhões de brasileiros. Tocavam em casamentos e em festas de quinze anos pelo país inteiro.</w:t>
+        <w:t>Músicas como Nosso Sonho e Só Love já faziam parte da vida de milhões de brasileiros. Tocavam em casamentos e em festas de quinze anos pelo país inteiro.</w:t>
       </w:r>
     </w:p>
     <w:p>
@@ -351,7 +327,7 @@
         <w:rPr>
           <w:color w:val="000000"/>
         </w:rPr>
-        <w:t>E a agenda daquele mês de julho incluía um show numa cidade pequena do interior de São Paulo.</w:t>
+        <w:t>E a agenda daquele mês de julho incluía um show numa cidade do interior de São Paulo.</w:t>
       </w:r>
     </w:p>
     <w:p>

</xml_diff>